<commit_message>
Ospitalità: chiuse tre caselle, Booking a Nadir e social ad Alex e Riccardo
Booking e AirBnB li tiene Nadir, avvio da uno a tre mesi secondo quanto
c'è già in piedi; la gestione social è di Alex e Riccardo, coi
collaboratori dietro.

Co-Authored-By: Claude Opus 5 <noreply@anthropic.com>
</commit_message>
<xml_diff>
--- a/materiali/YDG - Ospitalita - PRECOMPILATO 20-10.docx
+++ b/materiali/YDG - Ospitalita - PRECOMPILATO 20-10.docx
@@ -531,11 +531,11 @@
             </w:pPr>
             <w:r>
               <w:rPr>
-                <w:rFonts w:ascii="Montserrat" w:hAnsi="Montserrat" w:cs="Montserrat" w:eastAsia="Montserrat"/>
-                <w:color w:val="141414"/>
-                <w:sz w:val="18"/>
-              </w:rPr>
-              <w:t>Riccardo, Socio e Responsabile Social Media, tiene il servizio. Claudio (Strategia &amp; Copywriter) scrive, Lia (Graphic Designer) fa le grafiche, Kevin (Video Editor) monta, Gianmarco (Videomaker) e Mihaela (Photographer) girano e fotografano. Alex tiene il rapporto col cliente. DA VERIFICARE — quante strutture può reggere questa squadra in parallelo, e chi è il referente unico per l'ospitalità.</w:t>
+                <w:rFonts w:ascii="Montserrat" w:hAnsi="Montserrat" w:cs="Montserrat"/>
+                <w:color w:val="141414"/>
+                <w:sz w:val="18"/>
+              </w:rPr>
+              <w:t>Alex e Riccardo tengono il servizio e il rapporto col cliente. Claudio (Strategia &amp; Copywriter) scrive, Lia (Graphic Designer) fa le grafiche, Kevin (Video Editor) monta, Gianmarco (Videomaker) e Mihaela (Photographer) girano e fotografano.</w:t>
             </w:r>
           </w:p>
         </w:tc>
@@ -2017,7 +2017,7 @@
                 <w:color w:val="141414"/>
                 <w:sz w:val="18"/>
               </w:rPr>
-              <w:t>Alex. DA VERIFICARE — l'esperienza YDG è di un paio di casi, l'ultimo più strutturato: è quello il modello da seguire, e va scritto qui com'è andato.</w:t>
+              <w:t>Nadir.</w:t>
             </w:r>
           </w:p>
         </w:tc>
@@ -2080,22 +2080,11 @@
             </w:pPr>
             <w:r>
               <w:rPr>
-                <w:rFonts w:ascii="Montserrat" w:hAnsi="Montserrat" w:cs="Montserrat" w:eastAsia="Montserrat"/>
-                <w:b/>
-                <w:color w:val="E0661F"/>
-                <w:sz w:val="18"/>
-              </w:rPr>
-              <w:t>DA VERIFICARE —</w:t>
-            </w:r>
-            <w:r>
-              <w:rPr>
-                <w:rFonts w:ascii="Montserrat" w:hAnsi="Montserrat" w:cs="Montserrat" w:eastAsia="Montserrat"/>
-                <w:rFonts w:ascii="Archivo" w:hAnsi="Archivo"/>
-                <w:b w:val="0"/>
-                <w:color w:val="141414"/>
-                <w:sz w:val="18"/>
-              </w:rPr>
-              <w:t xml:space="preserve"> </w:t>
+                <w:rFonts w:ascii="Montserrat" w:hAnsi="Montserrat" w:cs="Montserrat"/>
+                <w:color w:val="141414"/>
+                <w:sz w:val="18"/>
+              </w:rPr>
+              <w:t>Da uno a tre mesi, secondo quanto c'è già in piedi: una struttura con schede e channel manager attivi si sistema in poche settimane, una che parte da zero sui portali porta via il trimestre.</w:t>
             </w:r>
           </w:p>
         </w:tc>

</xml_diff>

<commit_message>
Ospitalità: il CRM resta, con scritto che non si vende finché è vuoto
Deciso il 20/10 di tenerlo fra i cinque servizi. La nota dice che non
entra in brochure finché le sue caselle sono vuote.

Co-Authored-By: Claude Opus 5 <noreply@anthropic.com>
</commit_message>
<xml_diff>
--- a/materiali/YDG - Ospitalita - PRECOMPILATO 20-10.docx
+++ b/materiali/YDG - Ospitalita - PRECOMPILATO 20-10.docx
@@ -3200,11 +3200,11 @@
             </w:pPr>
             <w:r>
               <w:rPr>
-                <w:rFonts w:ascii="Montserrat" w:hAnsi="Montserrat" w:cs="Montserrat" w:eastAsia="Montserrat"/>
-                <w:color w:val="141414"/>
-                <w:sz w:val="18"/>
-              </w:rPr>
-              <w:t xml:space="preserve"> </w:t>
+                <w:rFonts w:ascii="Montserrat" w:hAnsi="Montserrat" w:cs="Montserrat"/>
+                <w:color w:val="141414"/>
+                <w:sz w:val="18"/>
+              </w:rPr>
+              <w:t>Resta fra i cinque servizi: deciso il 20/10 di tenerlo e riempirlo più avanti. Finché le caselle qui sopra sono vuote NON si mette in brochure e non si promette al cliente: sul database di un hotel ci sono vincoli di privacy veri, e prometterlo senza saperlo fare si paga.</w:t>
             </w:r>
           </w:p>
         </w:tc>

</xml_diff>